<commit_message>
Finalize Lab 1 submission details
</commit_message>
<xml_diff>
--- a/deliverables/word-reports/docx/Отчет_ЛР1_вариант1_Мегерян_Сергей_Сергеевич.docx
+++ b/deliverables/word-reports/docx/Отчет_ЛР1_вариант1_Мегерян_Сергей_Сергеевич.docx
@@ -383,7 +383,7 @@
         <w:rPr>
           <w:i w:val="0"/>
         </w:rPr>
-        <w:t>Линии PB0-PB5 порта B настроены на вывод и используются для непосредственного управления шестью светодиодами. Кнопки подключены к входам D2 и D3 в режиме INPUT_PULLUP. После обнаружения устойчивого нажатия выполняется инкремент или декремент текущего значения счетчика. Содержимое счетчика передается на младшие шесть разрядов регистра PORTB, что и формирует двоичный код на светодиодной линейке.</w:t>
+        <w:t>Линии PB0-PB5 порта B настроены на вывод и используются для непосредственного управления шестью светодиодами. Кнопки подключены к входам D2 и D3 в режиме INPUT_PULLUP. После обнаружения устойчивого нажатия выполняется инкремент или декремент текущего значения счетчика. Значение счетчика ограничено диапазоном от 0 до 63, то есть при достижении границ дальнейшее изменение в том же направлении не выполняется. Содержимое счетчика передается на младшие шесть разрядов регистра PORTB, что и формирует двоичный код на светодиодной линейке.</w:t>
       </w:r>
     </w:p>
     <w:p/>
@@ -410,7 +410,7 @@
         <w:rPr>
           <w:i w:val="0"/>
         </w:rPr>
-        <w:t>Программа отображает число от 0 до 63 в двоичном виде. Изменение состояния кнопок приводит к немедленному обновлению светодиодной индикации.</w:t>
+        <w:t>Программа отображает число от 0 до 63 в двоичном виде. Изменение состояния кнопок приводит к немедленному обновлению светодиодной индикации, при этом переход через границы диапазона не выполняется.</w:t>
       </w:r>
     </w:p>
     <w:p/>
@@ -1221,7 +1221,31 @@
           <w:rFonts w:ascii="Courier New" w:hAnsi="Courier New" w:eastAsia="Courier New"/>
           <w:sz w:val="18"/>
         </w:rPr>
-        <w:t xml:space="preserve">      counterValue = (counterValue + 1) &amp; PORTB_LED_MASK;</w:t>
+        <w:t xml:space="preserve">      if (counterValue &lt; PORTB_LED_MASK) {</w:t>
+      </w:r>
+    </w:p>
+    <w:p>
+      <w:pPr>
+        <w:spacing w:after="0"/>
+      </w:pPr>
+      <w:r>
+        <w:rPr>
+          <w:rFonts w:ascii="Courier New" w:hAnsi="Courier New" w:eastAsia="Courier New"/>
+          <w:sz w:val="18"/>
+        </w:rPr>
+        <w:t xml:space="preserve">        counterValue++;</w:t>
+      </w:r>
+    </w:p>
+    <w:p>
+      <w:pPr>
+        <w:spacing w:after="0"/>
+      </w:pPr>
+      <w:r>
+        <w:rPr>
+          <w:rFonts w:ascii="Courier New" w:hAnsi="Courier New" w:eastAsia="Courier New"/>
+          <w:sz w:val="18"/>
+        </w:rPr>
+        <w:t xml:space="preserve">      }</w:t>
       </w:r>
     </w:p>
     <w:p>
@@ -1433,7 +1457,31 @@
           <w:rFonts w:ascii="Courier New" w:hAnsi="Courier New" w:eastAsia="Courier New"/>
           <w:sz w:val="18"/>
         </w:rPr>
-        <w:t xml:space="preserve">      counterValue = (counterValue - 1) &amp; PORTB_LED_MASK;</w:t>
+        <w:t xml:space="preserve">      if (counterValue &gt; 0) {</w:t>
+      </w:r>
+    </w:p>
+    <w:p>
+      <w:pPr>
+        <w:spacing w:after="0"/>
+      </w:pPr>
+      <w:r>
+        <w:rPr>
+          <w:rFonts w:ascii="Courier New" w:hAnsi="Courier New" w:eastAsia="Courier New"/>
+          <w:sz w:val="18"/>
+        </w:rPr>
+        <w:t xml:space="preserve">        counterValue--;</w:t>
+      </w:r>
+    </w:p>
+    <w:p>
+      <w:pPr>
+        <w:spacing w:after="0"/>
+      </w:pPr>
+      <w:r>
+        <w:rPr>
+          <w:rFonts w:ascii="Courier New" w:hAnsi="Courier New" w:eastAsia="Courier New"/>
+          <w:sz w:val="18"/>
+        </w:rPr>
+        <w:t xml:space="preserve">      }</w:t>
       </w:r>
     </w:p>
     <w:p>

</xml_diff>

<commit_message>
Update reports with real photos and rename Lab 3 report
</commit_message>
<xml_diff>
--- a/deliverables/word-reports/docx/Отчет_ЛР1_вариант1_Мегерян_Сергей_Сергеевич.docx
+++ b/deliverables/word-reports/docx/Отчет_ЛР1_вариант1_Мегерян_Сергей_Сергеевич.docx
@@ -716,7 +716,7 @@
               <a:graphicData uri="http://schemas.openxmlformats.org/drawingml/2006/picture">
                 <pic:pic>
                   <pic:nvPicPr>
-                    <pic:cNvPr id="0" name="lab1_stand_photo.jpg"/>
+                    <pic:cNvPr id="0" name="lab1_real_stand_photo.jpg"/>
                     <pic:cNvPicPr/>
                   </pic:nvPicPr>
                   <pic:blipFill>
@@ -749,7 +749,7 @@
           <w:i/>
           <w:sz w:val="24"/>
         </w:rPr>
-        <w:t>Рисунок 2 - Пример собранного стенда</w:t>
+        <w:t>Рисунок 2 - Реальный собранный стенд лабораторной работы</w:t>
       </w:r>
     </w:p>
     <w:p>

</xml_diff>

<commit_message>
Add separate report packages for Arunova students
</commit_message>
<xml_diff>
--- a/deliverables/word-reports/docx/Отчет_ЛР1_вариант1_Мегерян_Сергей_Сергеевич.docx
+++ b/deliverables/word-reports/docx/Отчет_ЛР1_вариант1_Мегерян_Сергей_Сергеевич.docx
@@ -154,11 +154,122 @@
         <w:br w:type="page"/>
       </w:r>
     </w:p>
+    <w:p>
+      <w:pPr>
+        <w:spacing w:before="240" w:after="120"/>
+        <w:ind w:firstLine="0"/>
+      </w:pPr>
+      <w:r>
+        <w:rPr>
+          <w:rFonts w:ascii="Times New Roman" w:hAnsi="Times New Roman" w:eastAsia="Times New Roman"/>
+          <w:b/>
+          <w:sz w:val="32"/>
+        </w:rPr>
+        <w:t>Содержание</w:t>
+      </w:r>
+    </w:p>
+    <w:p>
+      <w:pPr>
+        <w:spacing w:line="288" w:lineRule="auto"/>
+        <w:ind w:left="0" w:firstLine="0"/>
+      </w:pPr>
+      <w:r>
+        <w:rPr>
+          <w:rFonts w:ascii="Times New Roman" w:hAnsi="Times New Roman" w:eastAsia="Times New Roman"/>
+          <w:sz w:val="28"/>
+        </w:rPr>
+        <w:t>Тема</w:t>
+      </w:r>
+    </w:p>
+    <w:p>
+      <w:pPr>
+        <w:spacing w:line="288" w:lineRule="auto"/>
+        <w:ind w:left="0" w:firstLine="0"/>
+      </w:pPr>
+      <w:r>
+        <w:rPr>
+          <w:rFonts w:ascii="Times New Roman" w:hAnsi="Times New Roman" w:eastAsia="Times New Roman"/>
+          <w:sz w:val="28"/>
+        </w:rPr>
+        <w:t>Цель работы</w:t>
+      </w:r>
+    </w:p>
+    <w:p>
+      <w:pPr>
+        <w:spacing w:line="288" w:lineRule="auto"/>
+        <w:ind w:left="0" w:firstLine="0"/>
+      </w:pPr>
+      <w:r>
+        <w:rPr>
+          <w:rFonts w:ascii="Times New Roman" w:hAnsi="Times New Roman" w:eastAsia="Times New Roman"/>
+          <w:sz w:val="28"/>
+        </w:rPr>
+        <w:t>Оборудование</w:t>
+      </w:r>
+    </w:p>
+    <w:p>
+      <w:pPr>
+        <w:spacing w:line="288" w:lineRule="auto"/>
+        <w:ind w:left="0" w:firstLine="0"/>
+      </w:pPr>
+      <w:r>
+        <w:rPr>
+          <w:rFonts w:ascii="Times New Roman" w:hAnsi="Times New Roman" w:eastAsia="Times New Roman"/>
+          <w:sz w:val="28"/>
+        </w:rPr>
+        <w:t>Схема подключения</w:t>
+      </w:r>
+    </w:p>
+    <w:p>
+      <w:pPr>
+        <w:spacing w:line="288" w:lineRule="auto"/>
+        <w:ind w:left="0" w:firstLine="0"/>
+      </w:pPr>
+      <w:r>
+        <w:rPr>
+          <w:rFonts w:ascii="Times New Roman" w:hAnsi="Times New Roman" w:eastAsia="Times New Roman"/>
+          <w:sz w:val="28"/>
+        </w:rPr>
+        <w:t>Описание алгоритма</w:t>
+      </w:r>
+    </w:p>
+    <w:p>
+      <w:pPr>
+        <w:spacing w:line="288" w:lineRule="auto"/>
+        <w:ind w:left="0" w:firstLine="0"/>
+      </w:pPr>
+      <w:r>
+        <w:rPr>
+          <w:rFonts w:ascii="Times New Roman" w:hAnsi="Times New Roman" w:eastAsia="Times New Roman"/>
+          <w:sz w:val="28"/>
+        </w:rPr>
+        <w:t>Результат работы программы</w:t>
+      </w:r>
+    </w:p>
+    <w:p>
+      <w:pPr>
+        <w:spacing w:line="288" w:lineRule="auto"/>
+        <w:ind w:left="0" w:firstLine="0"/>
+      </w:pPr>
+      <w:r>
+        <w:rPr>
+          <w:rFonts w:ascii="Times New Roman" w:hAnsi="Times New Roman" w:eastAsia="Times New Roman"/>
+          <w:sz w:val="28"/>
+        </w:rPr>
+        <w:t>Вывод</w:t>
+      </w:r>
+    </w:p>
+    <w:p>
+      <w:r>
+        <w:br w:type="page"/>
+      </w:r>
+    </w:p>
     <w:p/>
     <w:p/>
     <w:p>
       <w:pPr>
-        <w:spacing w:before="200" w:after="120"/>
+        <w:spacing w:before="240" w:after="120"/>
+        <w:ind w:firstLine="0"/>
       </w:pPr>
       <w:r>
         <w:rPr>
@@ -185,7 +296,8 @@
     <w:p/>
     <w:p>
       <w:pPr>
-        <w:spacing w:before="200" w:after="120"/>
+        <w:spacing w:before="240" w:after="120"/>
+        <w:ind w:firstLine="0"/>
       </w:pPr>
       <w:r>
         <w:rPr>
@@ -212,7 +324,8 @@
     <w:p/>
     <w:p>
       <w:pPr>
-        <w:spacing w:before="200" w:after="120"/>
+        <w:spacing w:before="240" w:after="120"/>
+        <w:ind w:firstLine="0"/>
       </w:pPr>
       <w:r>
         <w:rPr>
@@ -227,6 +340,8 @@
     <w:p>
       <w:pPr>
         <w:pStyle w:val="ListBullet"/>
+        <w:spacing w:line="360" w:lineRule="auto"/>
+        <w:ind w:firstLine="0"/>
       </w:pPr>
       <w:r>
         <w:rPr>
@@ -239,6 +354,8 @@
     <w:p>
       <w:pPr>
         <w:pStyle w:val="ListBullet"/>
+        <w:spacing w:line="360" w:lineRule="auto"/>
+        <w:ind w:firstLine="0"/>
       </w:pPr>
       <w:r>
         <w:rPr>
@@ -251,6 +368,8 @@
     <w:p>
       <w:pPr>
         <w:pStyle w:val="ListBullet"/>
+        <w:spacing w:line="360" w:lineRule="auto"/>
+        <w:ind w:firstLine="0"/>
       </w:pPr>
       <w:r>
         <w:rPr>
@@ -263,6 +382,8 @@
     <w:p>
       <w:pPr>
         <w:pStyle w:val="ListBullet"/>
+        <w:spacing w:line="360" w:lineRule="auto"/>
+        <w:ind w:firstLine="0"/>
       </w:pPr>
       <w:r>
         <w:rPr>
@@ -275,6 +396,8 @@
     <w:p>
       <w:pPr>
         <w:pStyle w:val="ListBullet"/>
+        <w:spacing w:line="360" w:lineRule="auto"/>
+        <w:ind w:firstLine="0"/>
       </w:pPr>
       <w:r>
         <w:rPr>
@@ -287,6 +410,8 @@
     <w:p>
       <w:pPr>
         <w:pStyle w:val="ListBullet"/>
+        <w:spacing w:line="360" w:lineRule="auto"/>
+        <w:ind w:firstLine="0"/>
       </w:pPr>
       <w:r>
         <w:rPr>
@@ -299,7 +424,8 @@
     <w:p/>
     <w:p>
       <w:pPr>
-        <w:spacing w:before="200" w:after="120"/>
+        <w:spacing w:before="240" w:after="120"/>
+        <w:ind w:firstLine="0"/>
       </w:pPr>
       <w:r>
         <w:rPr>
@@ -314,6 +440,8 @@
     <w:p>
       <w:pPr>
         <w:pStyle w:val="ListBullet"/>
+        <w:spacing w:line="360" w:lineRule="auto"/>
+        <w:ind w:firstLine="0"/>
       </w:pPr>
       <w:r>
         <w:rPr>
@@ -326,6 +454,8 @@
     <w:p>
       <w:pPr>
         <w:pStyle w:val="ListBullet"/>
+        <w:spacing w:line="360" w:lineRule="auto"/>
+        <w:ind w:firstLine="0"/>
       </w:pPr>
       <w:r>
         <w:rPr>
@@ -338,6 +468,8 @@
     <w:p>
       <w:pPr>
         <w:pStyle w:val="ListBullet"/>
+        <w:spacing w:line="360" w:lineRule="auto"/>
+        <w:ind w:firstLine="0"/>
       </w:pPr>
       <w:r>
         <w:rPr>
@@ -350,6 +482,8 @@
     <w:p>
       <w:pPr>
         <w:pStyle w:val="ListBullet"/>
+        <w:spacing w:line="360" w:lineRule="auto"/>
+        <w:ind w:firstLine="0"/>
       </w:pPr>
       <w:r>
         <w:rPr>
@@ -362,7 +496,8 @@
     <w:p/>
     <w:p>
       <w:pPr>
-        <w:spacing w:before="200" w:after="120"/>
+        <w:spacing w:before="240" w:after="120"/>
+        <w:ind w:firstLine="0"/>
       </w:pPr>
       <w:r>
         <w:rPr>
@@ -389,7 +524,8 @@
     <w:p/>
     <w:p>
       <w:pPr>
-        <w:spacing w:before="200" w:after="120"/>
+        <w:spacing w:before="240" w:after="120"/>
+        <w:ind w:firstLine="0"/>
       </w:pPr>
       <w:r>
         <w:rPr>
@@ -416,7 +552,8 @@
     <w:p/>
     <w:p>
       <w:pPr>
-        <w:spacing w:before="200" w:after="120"/>
+        <w:spacing w:before="240" w:after="120"/>
+        <w:ind w:firstLine="0"/>
       </w:pPr>
       <w:r>
         <w:rPr>
@@ -442,7 +579,8 @@
     </w:p>
     <w:p>
       <w:pPr>
-        <w:spacing w:before="200" w:after="120"/>
+        <w:spacing w:before="240" w:after="120"/>
+        <w:ind w:firstLine="0"/>
       </w:pPr>
       <w:r>
         <w:rPr>
@@ -637,7 +775,8 @@
     </w:tbl>
     <w:p>
       <w:pPr>
-        <w:spacing w:before="200" w:after="120"/>
+        <w:spacing w:before="240" w:after="120"/>
+        <w:ind w:firstLine="0"/>
       </w:pPr>
       <w:r>
         <w:rPr>
@@ -668,7 +807,7 @@
                     <pic:cNvPicPr/>
                   </pic:nvPicPr>
                   <pic:blipFill>
-                    <a:blip r:embed="rId9"/>
+                    <a:blip r:embed="rId10"/>
                     <a:stretch>
                       <a:fillRect/>
                     </a:stretch>
@@ -689,6 +828,7 @@
     </w:p>
     <w:p>
       <w:pPr>
+        <w:spacing w:after="160"/>
         <w:jc w:val="center"/>
       </w:pPr>
       <w:r>
@@ -707,7 +847,7 @@
       <w:r>
         <w:drawing>
           <wp:inline xmlns:a="http://schemas.openxmlformats.org/drawingml/2006/main" xmlns:pic="http://schemas.openxmlformats.org/drawingml/2006/picture">
-            <wp:extent cx="5220000" cy="6960000"/>
+            <wp:extent cx="5220000" cy="3915000"/>
             <wp:docPr id="2" name="Picture 2"/>
             <wp:cNvGraphicFramePr>
               <a:graphicFrameLocks noChangeAspect="1"/>
@@ -716,11 +856,64 @@
               <a:graphicData uri="http://schemas.openxmlformats.org/drawingml/2006/picture">
                 <pic:pic>
                   <pic:nvPicPr>
-                    <pic:cNvPr id="0" name="lab1_real_stand_photo.jpg"/>
+                    <pic:cNvPr id="0" name="lab1_v1_stand_photo.jpg"/>
                     <pic:cNvPicPr/>
                   </pic:nvPicPr>
                   <pic:blipFill>
-                    <a:blip r:embed="rId10"/>
+                    <a:blip r:embed="rId11"/>
+                    <a:stretch>
+                      <a:fillRect/>
+                    </a:stretch>
+                  </pic:blipFill>
+                  <pic:spPr>
+                    <a:xfrm>
+                      <a:off x="0" y="0"/>
+                      <a:ext cx="5220000" cy="3915000"/>
+                    </a:xfrm>
+                    <a:prstGeom prst="rect"/>
+                  </pic:spPr>
+                </pic:pic>
+              </a:graphicData>
+            </a:graphic>
+          </wp:inline>
+        </w:drawing>
+      </w:r>
+    </w:p>
+    <w:p>
+      <w:pPr>
+        <w:spacing w:after="160"/>
+        <w:jc w:val="center"/>
+      </w:pPr>
+      <w:r>
+        <w:rPr>
+          <w:rFonts w:ascii="Times New Roman" w:hAnsi="Times New Roman" w:eastAsia="Times New Roman"/>
+          <w:i/>
+          <w:sz w:val="24"/>
+        </w:rPr>
+        <w:t>Рисунок 2 - Собранный стенд лабораторной работы, вариант 1</w:t>
+      </w:r>
+    </w:p>
+    <w:p>
+      <w:pPr>
+        <w:jc w:val="center"/>
+      </w:pPr>
+      <w:r>
+        <w:drawing>
+          <wp:inline xmlns:a="http://schemas.openxmlformats.org/drawingml/2006/main" xmlns:pic="http://schemas.openxmlformats.org/drawingml/2006/picture">
+            <wp:extent cx="5220000" cy="6960000"/>
+            <wp:docPr id="3" name="Picture 3"/>
+            <wp:cNvGraphicFramePr>
+              <a:graphicFrameLocks noChangeAspect="1"/>
+            </wp:cNvGraphicFramePr>
+            <a:graphic>
+              <a:graphicData uri="http://schemas.openxmlformats.org/drawingml/2006/picture">
+                <pic:pic>
+                  <pic:nvPicPr>
+                    <pic:cNvPr id="0" name="lab1_v1_result_photo.jpg"/>
+                    <pic:cNvPicPr/>
+                  </pic:nvPicPr>
+                  <pic:blipFill>
+                    <a:blip r:embed="rId12"/>
                     <a:stretch>
                       <a:fillRect/>
                     </a:stretch>
@@ -741,6 +934,7 @@
     </w:p>
     <w:p>
       <w:pPr>
+        <w:spacing w:after="160"/>
         <w:jc w:val="center"/>
       </w:pPr>
       <w:r>
@@ -749,7 +943,7 @@
           <w:i/>
           <w:sz w:val="24"/>
         </w:rPr>
-        <w:t>Рисунок 2 - Реальный собранный стенд лабораторной работы</w:t>
+        <w:t>Рисунок 3 - Отображение двоичного числа на светодиодной линейке</w:t>
       </w:r>
     </w:p>
     <w:p>
@@ -760,7 +954,7 @@
         <w:drawing>
           <wp:inline xmlns:a="http://schemas.openxmlformats.org/drawingml/2006/main" xmlns:pic="http://schemas.openxmlformats.org/drawingml/2006/picture">
             <wp:extent cx="5220000" cy="3132000"/>
-            <wp:docPr id="3" name="Picture 3"/>
+            <wp:docPr id="4" name="Picture 4"/>
             <wp:cNvGraphicFramePr>
               <a:graphicFrameLocks noChangeAspect="1"/>
             </wp:cNvGraphicFramePr>
@@ -772,7 +966,7 @@
                     <pic:cNvPicPr/>
                   </pic:nvPicPr>
                   <pic:blipFill>
-                    <a:blip r:embed="rId11"/>
+                    <a:blip r:embed="rId13"/>
                     <a:stretch>
                       <a:fillRect/>
                     </a:stretch>
@@ -793,6 +987,7 @@
     </w:p>
     <w:p>
       <w:pPr>
+        <w:spacing w:after="160"/>
         <w:jc w:val="center"/>
       </w:pPr>
       <w:r>
@@ -801,12 +996,13 @@
           <w:i/>
           <w:sz w:val="24"/>
         </w:rPr>
-        <w:t>Рисунок 3 - Пример отображения двоичного числа</w:t>
+        <w:t>Рисунок 4 - Иллюстрация кодирования 6-битного значения</w:t>
       </w:r>
     </w:p>
     <w:p>
       <w:pPr>
-        <w:spacing w:before="200" w:after="120"/>
+        <w:spacing w:before="240" w:after="120"/>
+        <w:ind w:firstLine="0"/>
       </w:pPr>
       <w:r>
         <w:rPr>
@@ -1687,13 +1883,31 @@
     </w:p>
     <w:p/>
     <w:sectPr>
+      <w:footerReference w:type="default" r:id="rId9"/>
       <w:pgSz w:w="12240" w:h="15840"/>
       <w:pgMar w:top="1134" w:right="850" w:bottom="1134" w:left="1701" w:header="720" w:footer="720" w:gutter="0"/>
       <w:cols w:space="720"/>
+      <w:titlePg/>
       <w:docGrid w:linePitch="360"/>
     </w:sectPr>
   </w:body>
 </w:document>
+</file>
+
+<file path=word/footer1.xml><?xml version="1.0" encoding="utf-8"?>
+<w:ftr xmlns:m="http://schemas.openxmlformats.org/officeDocument/2006/math" xmlns:mc="http://schemas.openxmlformats.org/markup-compatibility/2006" xmlns:mo="http://schemas.microsoft.com/office/mac/office/2008/main" xmlns:mv="urn:schemas-microsoft-com:mac:vml" xmlns:o="urn:schemas-microsoft-com:office:office" xmlns:r="http://schemas.openxmlformats.org/officeDocument/2006/relationships" xmlns:v="urn:schemas-microsoft-com:vml" xmlns:w10="urn:schemas-microsoft-com:office:word" xmlns:w14="http://schemas.microsoft.com/office/word/2010/wordml" xmlns:w="http://schemas.openxmlformats.org/wordprocessingml/2006/main" xmlns:wne="http://schemas.microsoft.com/office/word/2006/wordml" xmlns:wp14="http://schemas.microsoft.com/office/word/2010/wordprocessingDrawing" xmlns:wp="http://schemas.openxmlformats.org/drawingml/2006/wordprocessingDrawing" xmlns:wpc="http://schemas.microsoft.com/office/word/2010/wordprocessingCanvas" xmlns:wpg="http://schemas.microsoft.com/office/word/2010/wordprocessingGroup" xmlns:wpi="http://schemas.microsoft.com/office/word/2010/wordprocessingInk" xmlns:wps="http://schemas.microsoft.com/office/word/2010/wordprocessingShape" mc:Ignorable="w14 wp14">
+  <w:p>
+    <w:pPr>
+      <w:pStyle w:val="Footer"/>
+      <w:jc w:val="center"/>
+    </w:pPr>
+    <w:r>
+      <w:fldChar w:fldCharType="begin"/>
+      <w:instrText xml:space="preserve">PAGE</w:instrText>
+      <w:fldChar w:fldCharType="end"/>
+    </w:r>
+  </w:p>
+</w:ftr>
 </file>
 
 <file path=word/numbering.xml><?xml version="1.0" encoding="utf-8"?>
@@ -2059,6 +2273,10 @@
     <w:name w:val="Normal"/>
     <w:qFormat/>
     <w:rsid w:val="00FC693F"/>
+    <w:pPr>
+      <w:spacing w:line="360" w:lineRule="auto"/>
+      <w:ind w:firstLine="709"/>
+    </w:pPr>
     <w:rPr>
       <w:rFonts w:ascii="Times New Roman" w:hAnsi="Times New Roman" w:eastAsia="Times New Roman"/>
       <w:sz w:val="28"/>

</xml_diff>